<commit_message>
Align submission deck with lecturer guidance
</commit_message>
<xml_diff>
--- a/Product Docs/Submission/InvestigateIQ_Product_Blueprint.docx
+++ b/Product Docs/Submission/InvestigateIQ_Product_Blueprint.docx
@@ -876,6 +876,415 @@
         <w:t xml:space="preserve">A record, citation, retrieval result, rule match, or confidence score is an aid to review—not proof that money is lawful, unlawful, fraudulent, or laundered.</w:t>
       </w:r>
     </w:p>
+    <w:p>
+      <w:pPr>
+        <w:pStyle w:val="Heading2"/>
+        <w:spacing w:after="130" w:before="210"/>
+      </w:pPr>
+      <w:r>
+        <w:t xml:space="preserve">Lecturer submission alignment</w:t>
+      </w:r>
+    </w:p>
+    <w:p>
+      <w:pPr>
+        <w:spacing w:after="140" w:before="0" w:line="276"/>
+      </w:pPr>
+      <w:r>
+        <w:rPr>
+          <w:rFonts w:ascii="Aptos" w:cs="Aptos" w:eastAsia="Aptos" w:hAnsi="Aptos"/>
+          <w:b w:val="false"/>
+          <w:bCs w:val="false"/>
+          <w:i w:val="false"/>
+          <w:iCs w:val="false"/>
+          <w:color w:val="16335D"/>
+          <w:sz w:val="21"/>
+          <w:szCs w:val="21"/>
+        </w:rPr>
+        <w:t xml:space="preserve">Selected submission track: Blueprint + Prototype + Detailed code + Final results. The submission includes this detailed blueprint, the working prototype and live walkthrough, the documented Streamlit/SQLite/OKF/RAG implementation logic, current screen evidence, validation results, and the 15-minute presentation materials.</w:t>
+      </w:r>
+    </w:p>
+    <w:tbl>
+      <w:tblPr>
+        <w:tblW w:type="dxa" w:w="9360"/>
+        <w:tblBorders>
+          <w:top w:val="single" w:color="auto" w:sz="4"/>
+          <w:left w:val="single" w:color="auto" w:sz="4"/>
+          <w:bottom w:val="single" w:color="auto" w:sz="4"/>
+          <w:right w:val="single" w:color="auto" w:sz="4"/>
+          <w:insideH w:val="single" w:color="auto" w:sz="4"/>
+          <w:insideV w:val="single" w:color="auto" w:sz="4"/>
+        </w:tblBorders>
+      </w:tblPr>
+      <w:tblGrid>
+        <w:gridCol w:w="2450"/>
+        <w:gridCol w:w="6910"/>
+      </w:tblGrid>
+      <w:tr>
+        <w:trPr>
+          <w:tblHeader/>
+        </w:trPr>
+        <w:tc>
+          <w:tcPr>
+            <w:tcW w:type="dxa" w:w="2450"/>
+            <w:tcBorders>
+              <w:top w:val="single" w:color="B7CBEA" w:sz="6"/>
+              <w:left w:val="single" w:color="B7CBEA" w:sz="6"/>
+              <w:bottom w:val="single" w:color="B7CBEA" w:sz="6"/>
+              <w:right w:val="single" w:color="B7CBEA" w:sz="6"/>
+            </w:tcBorders>
+            <w:shd w:fill="16335D" w:color="16335D" w:val="clear"/>
+            <w:tcMar>
+              <w:top w:type="dxa" w:w="90"/>
+              <w:left w:type="dxa" w:w="110"/>
+              <w:bottom w:type="dxa" w:w="90"/>
+              <w:right w:type="dxa" w:w="110"/>
+            </w:tcMar>
+          </w:tcPr>
+          <w:p>
+            <w:pPr>
+              <w:spacing w:after="0" w:before="0" w:line="230"/>
+            </w:pPr>
+            <w:r>
+              <w:rPr>
+                <w:rFonts w:ascii="Aptos" w:cs="Aptos" w:eastAsia="Aptos" w:hAnsi="Aptos"/>
+                <w:b/>
+                <w:bCs/>
+                <w:i w:val="false"/>
+                <w:iCs w:val="false"/>
+                <w:color w:val="FFFFFF"/>
+                <w:sz w:val="18"/>
+                <w:szCs w:val="18"/>
+              </w:rPr>
+              <w:t xml:space="preserve">Requirement</w:t>
+            </w:r>
+          </w:p>
+        </w:tc>
+        <w:tc>
+          <w:tcPr>
+            <w:tcW w:type="dxa" w:w="6910"/>
+            <w:tcBorders>
+              <w:top w:val="single" w:color="B7CBEA" w:sz="6"/>
+              <w:left w:val="single" w:color="B7CBEA" w:sz="6"/>
+              <w:bottom w:val="single" w:color="B7CBEA" w:sz="6"/>
+              <w:right w:val="single" w:color="B7CBEA" w:sz="6"/>
+            </w:tcBorders>
+            <w:shd w:fill="16335D" w:color="16335D" w:val="clear"/>
+            <w:tcMar>
+              <w:top w:type="dxa" w:w="90"/>
+              <w:left w:type="dxa" w:w="110"/>
+              <w:bottom w:type="dxa" w:w="90"/>
+              <w:right w:type="dxa" w:w="110"/>
+            </w:tcMar>
+          </w:tcPr>
+          <w:p>
+            <w:pPr>
+              <w:spacing w:after="0" w:before="0" w:line="230"/>
+            </w:pPr>
+            <w:r>
+              <w:rPr>
+                <w:rFonts w:ascii="Aptos" w:cs="Aptos" w:eastAsia="Aptos" w:hAnsi="Aptos"/>
+                <w:b/>
+                <w:bCs/>
+                <w:i w:val="false"/>
+                <w:iCs w:val="false"/>
+                <w:color w:val="FFFFFF"/>
+                <w:sz w:val="18"/>
+                <w:szCs w:val="18"/>
+              </w:rPr>
+              <w:t xml:space="preserve">How this submission addresses it</w:t>
+            </w:r>
+          </w:p>
+        </w:tc>
+      </w:tr>
+      <w:tr>
+        <w:tc>
+          <w:tcPr>
+            <w:tcW w:type="dxa" w:w="2450"/>
+            <w:tcBorders>
+              <w:top w:val="single" w:color="B7CBEA" w:sz="6"/>
+              <w:left w:val="single" w:color="B7CBEA" w:sz="6"/>
+              <w:bottom w:val="single" w:color="B7CBEA" w:sz="6"/>
+              <w:right w:val="single" w:color="B7CBEA" w:sz="6"/>
+            </w:tcBorders>
+            <w:tcMar>
+              <w:top w:type="dxa" w:w="90"/>
+              <w:left w:type="dxa" w:w="110"/>
+              <w:bottom w:type="dxa" w:w="90"/>
+              <w:right w:type="dxa" w:w="110"/>
+            </w:tcMar>
+          </w:tcPr>
+          <w:p>
+            <w:pPr>
+              <w:spacing w:after="0" w:before="0" w:line="230"/>
+            </w:pPr>
+            <w:r>
+              <w:rPr>
+                <w:rFonts w:ascii="Aptos" w:cs="Aptos" w:eastAsia="Aptos" w:hAnsi="Aptos"/>
+                <w:b w:val="false"/>
+                <w:bCs w:val="false"/>
+                <w:i w:val="false"/>
+                <w:iCs w:val="false"/>
+                <w:color w:val="16335D"/>
+                <w:sz w:val="18"/>
+                <w:szCs w:val="18"/>
+              </w:rPr>
+              <w:t xml:space="preserve">Detailed blueprint</w:t>
+            </w:r>
+          </w:p>
+        </w:tc>
+        <w:tc>
+          <w:tcPr>
+            <w:tcW w:type="dxa" w:w="6910"/>
+            <w:tcBorders>
+              <w:top w:val="single" w:color="B7CBEA" w:sz="6"/>
+              <w:left w:val="single" w:color="B7CBEA" w:sz="6"/>
+              <w:bottom w:val="single" w:color="B7CBEA" w:sz="6"/>
+              <w:right w:val="single" w:color="B7CBEA" w:sz="6"/>
+            </w:tcBorders>
+            <w:tcMar>
+              <w:top w:type="dxa" w:w="90"/>
+              <w:left w:type="dxa" w:w="110"/>
+              <w:bottom w:type="dxa" w:w="90"/>
+              <w:right w:type="dxa" w:w="110"/>
+            </w:tcMar>
+          </w:tcPr>
+          <w:p>
+            <w:pPr>
+              <w:spacing w:after="0" w:before="0" w:line="230"/>
+            </w:pPr>
+            <w:r>
+              <w:rPr>
+                <w:rFonts w:ascii="Aptos" w:cs="Aptos" w:eastAsia="Aptos" w:hAnsi="Aptos"/>
+                <w:b w:val="false"/>
+                <w:bCs w:val="false"/>
+                <w:i w:val="false"/>
+                <w:iCs w:val="false"/>
+                <w:color w:val="16335D"/>
+                <w:sz w:val="18"/>
+                <w:szCs w:val="18"/>
+              </w:rPr>
+              <w:t xml:space="preserve">Documents the program statement, user workflow, evidence model, coding logic, responsible-AI limits, ROI measurement plan, and future roadmap.</w:t>
+            </w:r>
+          </w:p>
+        </w:tc>
+      </w:tr>
+      <w:tr>
+        <w:tc>
+          <w:tcPr>
+            <w:tcW w:type="dxa" w:w="2450"/>
+            <w:tcBorders>
+              <w:top w:val="single" w:color="B7CBEA" w:sz="6"/>
+              <w:left w:val="single" w:color="B7CBEA" w:sz="6"/>
+              <w:bottom w:val="single" w:color="B7CBEA" w:sz="6"/>
+              <w:right w:val="single" w:color="B7CBEA" w:sz="6"/>
+            </w:tcBorders>
+            <w:tcMar>
+              <w:top w:type="dxa" w:w="90"/>
+              <w:left w:type="dxa" w:w="110"/>
+              <w:bottom w:type="dxa" w:w="90"/>
+              <w:right w:type="dxa" w:w="110"/>
+            </w:tcMar>
+          </w:tcPr>
+          <w:p>
+            <w:pPr>
+              <w:spacing w:after="0" w:before="0" w:line="230"/>
+            </w:pPr>
+            <w:r>
+              <w:rPr>
+                <w:rFonts w:ascii="Aptos" w:cs="Aptos" w:eastAsia="Aptos" w:hAnsi="Aptos"/>
+                <w:b w:val="false"/>
+                <w:bCs w:val="false"/>
+                <w:i w:val="false"/>
+                <w:iCs w:val="false"/>
+                <w:color w:val="16335D"/>
+                <w:sz w:val="18"/>
+                <w:szCs w:val="18"/>
+              </w:rPr>
+              <w:t xml:space="preserve">Prototype and detailed code</w:t>
+            </w:r>
+          </w:p>
+        </w:tc>
+        <w:tc>
+          <w:tcPr>
+            <w:tcW w:type="dxa" w:w="6910"/>
+            <w:tcBorders>
+              <w:top w:val="single" w:color="B7CBEA" w:sz="6"/>
+              <w:left w:val="single" w:color="B7CBEA" w:sz="6"/>
+              <w:bottom w:val="single" w:color="B7CBEA" w:sz="6"/>
+              <w:right w:val="single" w:color="B7CBEA" w:sz="6"/>
+            </w:tcBorders>
+            <w:tcMar>
+              <w:top w:type="dxa" w:w="90"/>
+              <w:left w:type="dxa" w:w="110"/>
+              <w:bottom w:type="dxa" w:w="90"/>
+              <w:right w:type="dxa" w:w="110"/>
+            </w:tcMar>
+          </w:tcPr>
+          <w:p>
+            <w:pPr>
+              <w:spacing w:after="0" w:before="0" w:line="230"/>
+            </w:pPr>
+            <w:r>
+              <w:rPr>
+                <w:rFonts w:ascii="Aptos" w:cs="Aptos" w:eastAsia="Aptos" w:hAnsi="Aptos"/>
+                <w:b w:val="false"/>
+                <w:bCs w:val="false"/>
+                <w:i w:val="false"/>
+                <w:iCs w:val="false"/>
+                <w:color w:val="16335D"/>
+                <w:sz w:val="18"/>
+                <w:szCs w:val="18"/>
+              </w:rPr>
+              <w:t xml:space="preserve">The working Streamlit prototype is demonstrated live; the Blueprint maps its router, page modules, SQLite stores, OKF ingestion, chunking, FTS5/BM25 retrieval, confidence checks, and audit-state logic.</w:t>
+            </w:r>
+          </w:p>
+        </w:tc>
+      </w:tr>
+      <w:tr>
+        <w:tc>
+          <w:tcPr>
+            <w:tcW w:type="dxa" w:w="2450"/>
+            <w:tcBorders>
+              <w:top w:val="single" w:color="B7CBEA" w:sz="6"/>
+              <w:left w:val="single" w:color="B7CBEA" w:sz="6"/>
+              <w:bottom w:val="single" w:color="B7CBEA" w:sz="6"/>
+              <w:right w:val="single" w:color="B7CBEA" w:sz="6"/>
+            </w:tcBorders>
+            <w:tcMar>
+              <w:top w:type="dxa" w:w="90"/>
+              <w:left w:type="dxa" w:w="110"/>
+              <w:bottom w:type="dxa" w:w="90"/>
+              <w:right w:type="dxa" w:w="110"/>
+            </w:tcMar>
+          </w:tcPr>
+          <w:p>
+            <w:pPr>
+              <w:spacing w:after="0" w:before="0" w:line="230"/>
+            </w:pPr>
+            <w:r>
+              <w:rPr>
+                <w:rFonts w:ascii="Aptos" w:cs="Aptos" w:eastAsia="Aptos" w:hAnsi="Aptos"/>
+                <w:b w:val="false"/>
+                <w:bCs w:val="false"/>
+                <w:i w:val="false"/>
+                <w:iCs w:val="false"/>
+                <w:color w:val="16335D"/>
+                <w:sz w:val="18"/>
+                <w:szCs w:val="18"/>
+              </w:rPr>
+              <w:t xml:space="preserve">Final results</w:t>
+            </w:r>
+          </w:p>
+        </w:tc>
+        <w:tc>
+          <w:tcPr>
+            <w:tcW w:type="dxa" w:w="6910"/>
+            <w:tcBorders>
+              <w:top w:val="single" w:color="B7CBEA" w:sz="6"/>
+              <w:left w:val="single" w:color="B7CBEA" w:sz="6"/>
+              <w:bottom w:val="single" w:color="B7CBEA" w:sz="6"/>
+              <w:right w:val="single" w:color="B7CBEA" w:sz="6"/>
+            </w:tcBorders>
+            <w:tcMar>
+              <w:top w:type="dxa" w:w="90"/>
+              <w:left w:type="dxa" w:w="110"/>
+              <w:bottom w:type="dxa" w:w="90"/>
+              <w:right w:type="dxa" w:w="110"/>
+            </w:tcMar>
+          </w:tcPr>
+          <w:p>
+            <w:pPr>
+              <w:spacing w:after="0" w:before="0" w:line="230"/>
+            </w:pPr>
+            <w:r>
+              <w:rPr>
+                <w:rFonts w:ascii="Aptos" w:cs="Aptos" w:eastAsia="Aptos" w:hAnsi="Aptos"/>
+                <w:b w:val="false"/>
+                <w:bCs w:val="false"/>
+                <w:i w:val="false"/>
+                <w:iCs w:val="false"/>
+                <w:color w:val="16335D"/>
+                <w:sz w:val="18"/>
+                <w:szCs w:val="18"/>
+              </w:rPr>
+              <w:t xml:space="preserve">Provides current product captures, validation/deployment evidence, a rebuilt walkthrough plan, and measurable pilot success criteria rather than unsupported performance claims.</w:t>
+            </w:r>
+          </w:p>
+        </w:tc>
+      </w:tr>
+      <w:tr>
+        <w:tc>
+          <w:tcPr>
+            <w:tcW w:type="dxa" w:w="2450"/>
+            <w:tcBorders>
+              <w:top w:val="single" w:color="B7CBEA" w:sz="6"/>
+              <w:left w:val="single" w:color="B7CBEA" w:sz="6"/>
+              <w:bottom w:val="single" w:color="B7CBEA" w:sz="6"/>
+              <w:right w:val="single" w:color="B7CBEA" w:sz="6"/>
+            </w:tcBorders>
+            <w:tcMar>
+              <w:top w:type="dxa" w:w="90"/>
+              <w:left w:type="dxa" w:w="110"/>
+              <w:bottom w:type="dxa" w:w="90"/>
+              <w:right w:type="dxa" w:w="110"/>
+            </w:tcMar>
+          </w:tcPr>
+          <w:p>
+            <w:pPr>
+              <w:spacing w:after="0" w:before="0" w:line="230"/>
+            </w:pPr>
+            <w:r>
+              <w:rPr>
+                <w:rFonts w:ascii="Aptos" w:cs="Aptos" w:eastAsia="Aptos" w:hAnsi="Aptos"/>
+                <w:b w:val="false"/>
+                <w:bCs w:val="false"/>
+                <w:i w:val="false"/>
+                <w:iCs w:val="false"/>
+                <w:color w:val="16335D"/>
+                <w:sz w:val="18"/>
+                <w:szCs w:val="18"/>
+              </w:rPr>
+              <w:t xml:space="preserve">15-minute presentation</w:t>
+            </w:r>
+          </w:p>
+        </w:tc>
+        <w:tc>
+          <w:tcPr>
+            <w:tcW w:type="dxa" w:w="6910"/>
+            <w:tcBorders>
+              <w:top w:val="single" w:color="B7CBEA" w:sz="6"/>
+              <w:left w:val="single" w:color="B7CBEA" w:sz="6"/>
+              <w:bottom w:val="single" w:color="B7CBEA" w:sz="6"/>
+              <w:right w:val="single" w:color="B7CBEA" w:sz="6"/>
+            </w:tcBorders>
+            <w:tcMar>
+              <w:top w:type="dxa" w:w="90"/>
+              <w:left w:type="dxa" w:w="110"/>
+              <w:bottom w:type="dxa" w:w="90"/>
+              <w:right w:type="dxa" w:w="110"/>
+            </w:tcMar>
+          </w:tcPr>
+          <w:p>
+            <w:pPr>
+              <w:spacing w:after="0" w:before="0" w:line="230"/>
+            </w:pPr>
+            <w:r>
+              <w:rPr>
+                <w:rFonts w:ascii="Aptos" w:cs="Aptos" w:eastAsia="Aptos" w:hAnsi="Aptos"/>
+                <w:b w:val="false"/>
+                <w:bCs w:val="false"/>
+                <w:i w:val="false"/>
+                <w:iCs w:val="false"/>
+                <w:color w:val="16335D"/>
+                <w:sz w:val="18"/>
+                <w:szCs w:val="18"/>
+              </w:rPr>
+              <w:t xml:space="preserve">The single presenter will be confirmed tomorrow. The concise deck is timed for 7 minutes 10 seconds, followed by a 4 minute 50 second live demo and 3 minutes for evaluation-panel questions. The slide deck remains available as a structured backup to the live demonstration.</w:t>
+            </w:r>
+          </w:p>
+        </w:tc>
+      </w:tr>
+    </w:tbl>
     <w:p>
       <w:pPr>
         <w:pStyle w:val="Heading2"/>

</xml_diff>